<commit_message>
Round 1 independent panel review: fix edge counts (28,972/98,254), composition derivation (120+45/72-unannotated/33-trackless), honest benchmark reframing, alias-resolved recovery, enumerate 9 pathways, DRD2/COMT limitation
</commit_message>
<xml_diff>
--- a/submission_BMC/manuscript_BMC.docx
+++ b/submission_BMC/manuscript_BMC.docx
@@ -149,7 +149,7 @@
         <w:t>Stage 1: Core gene curation.</w:t>
       </w:r>
       <w:r>
-        <w:t xml:space="preserve"> 192 pain genes were manually curated from 20 literature-defined functional categories: nociceptor transduction channels, voltage-gated sodium and calcium channels, neuropeptide signaling, neurotrophin signaling, the opioid system, inflammatory cytokines and receptors, MAPK, JAK–STAT, and NF-κB pathways, the prostaglandin pathway, complement cascade, GABA/glycine and serotonin receptors, the endocannabinoid system, kinase signaling, transcription factors, RA-specific genes, and anesthetic targets. Inclusion required (1) published experimental evidence for a role in pain signaling, nociception, or RA inflammation in at least two independent studies (PubMed: "gene_symbol AND (pain OR nociception OR rheumatoid arthritis)"), or (2) designation as a known analgesic or RA drug target in the IUPHAR/BPS Guide to Pharmacology [14] or DrugBank. The full list with functional assignments and PMIDs is in Supplementary Table S1.</w:t>
+        <w:t xml:space="preserve"> 192 pain genes were manually curated from 20 literature-defined functional categories: nociceptor transduction channels, voltage-gated sodium and calcium channels, neuropeptide signaling, neurotrophin signaling, the opioid system, inflammatory cytokines and receptors, MAPK, JAK–STAT, and NF-κB pathways, the prostaglandin pathway, complement cascade, GABA/glycine and serotonin receptors, the endocannabinoid system, kinase signaling, transcription factors, RA-specific genes, and anesthetic targets. These 20 categories were organized into nine core pain signaling pathways — (1) nociceptor transduction (TRP and voltage-gated channels), (2) synaptic transmission (neuropeptide and neurotrophin signaling), (3) the opioid system, (4) inflammatory cytokine signaling (cytokines, receptors, JAK–STAT, NF-κB, MAPK), (5) prostaglandin signaling, (6) complement cascade, (7) inhibitory modulation (GABA/glycine, serotonin, endocannabinoid), (8) kinase signaling, and (9) RA-specific and anesthetic-target pathways — enumerated explicitly to aid reproducibility. Inclusion required (1) published experimental evidence for a role in pain signaling, nociception, or RA inflammation in at least two independent studies (PubMed: "gene_symbol AND (pain OR nociception OR rheumatoid arthritis)"), or (2) designation as a known analgesic or RA drug target in the IUPHAR/BPS Guide to Pharmacology [14] or DrugBank. The full list with functional assignments and PMIDs is in Supplementary Table S1.</w:t>
       </w:r>
     </w:p>
     <w:p>
@@ -160,7 +160,7 @@
         <w:t>Stage 2: PrimeKG integration and track assignment.</w:t>
       </w:r>
       <w:r>
-        <w:t xml:space="preserve"> Of 192 curated genes, 189 (98.4%) matched PrimeKG v1.0 node symbols by exact, case-insensitive matching; 188 of 192 are present in the final RA-PainKG graph (one matched gene was not retained during construction). The pipeline identified 190 seed gene nodes. From these seeds, a 2-hop neighborhood expansion with a connectivity filter (nodes reachable from at least two seed categories) identified 45 additional pain-relevant genes (e.g., CCR6, CSF2, IRF5, IFNG, FCGR3A), yielding a final annotated set of 165 genes organized into Track A (immune-inflammation, 106 genes) and Track B (nociception–pain transduction, 122 genes, with 96 overlapping).</w:t>
+        <w:t xml:space="preserve"> Of 192 curated genes, 189 (98.4%) matched PrimeKG v1.0 node symbols by exact, case-insensitive matching; 188 of 192 are present in the final RA-PainKG graph by exact symbol (one matched gene, ADRA2B, was not retained during construction). The pipeline identified 190 seed gene/protein nodes; 120 of the 192 curated genes were retained as the curated core of the annotated set. A 2-hop neighborhood expansion with a connectivity filter (nodes reachable from at least two seed categories) added 45 additional pain-relevant genes (e.g., CCR6, CSF2, IRF5, IFNG, FCGR3A), yielding a final annotated set of 165 genes (120 curated + 45 expansion). Of the 192 curated genes, 72 were not retained in the dual-track annotated set; 68 of these are present in the graph but were not assigned dual-track annotations, and 4 are identifier/construction artifacts (see Recovery and residual-gap analysis). Among the 165 annotated genes, 106 were assigned to Track A (immune-inflammation), 122 to Track B (nociception–pain transduction), with 96 in both; 33 annotated genes were assigned to neither track pending further curation.</w:t>
       </w:r>
     </w:p>
     <w:p>
@@ -182,7 +182,7 @@
         <w:t>Stage 3: Edge integration.</w:t>
       </w:r>
       <w:r>
-        <w:t xml:space="preserve"> All PrimeKG edges involving the 165 annotated genes were retained: 2,400 protein–protein interaction edges and 124,826 non-PPI edges (pathway, bioprocess, and drug–target across 24 relation types). Graph statistics: 18,069 nodes (10 entity types) and 127,226 directed edges. Only 44 of 165 annotated genes (26.7%) overlap the Norman K562 Perturb-seq gene vocabulary (Supplementary Table S6).</w:t>
+        <w:t xml:space="preserve"> All PrimeKG edge types were integrated. The full graph contains 127,226 directed edges across 24 relation types, comprising 28,972 protein–protein interaction (PPI) edges and 98,254 edges of other types (pathway, biological process, anatomy, disease, phenotype, and drug–target); 4,760 are drug–target edges. The 165 annotated pain genes are labeled as nodes carrying dual-track and tissue-expression attributes, but the graph integrates the entire PrimeKG edge set rather than only edges incident to those genes. For benchmarking, a PPI-only variant retaining 2,400 edges among the annotated genes was used (see Perturbation data and benchmark validation). Only 44 of 165 annotated genes (26.7%) overlap the Norman K562 Perturb-seq gene vocabulary (Supplementary Table S6).</w:t>
       </w:r>
     </w:p>
     <w:p>
@@ -231,7 +231,7 @@
     </w:p>
     <w:p>
       <w:r>
-        <w:t>Python 3.10+, ScanPy 1.12, NetworkX 3.6, NumPy, SciPy, and scikit-learn were used; total compute was approximately 12 minutes (Intel i9-13900K, 64 GB RAM). Full pipeline and processed data are at https://github.com/yyx-4113/ra-painkg. During manuscript preparation the author used AI-assisted tools (OpenAI Codex CLI, GitHub Copilot, and Claude via API) for code development, literature search, and language editing. All AI-generated content was reviewed and verified by the author, who takes full responsibility for scientific accuracy, data integrity, and conclusions. No AI tool contributed to data generation or statistical computation beyond executing author-specified algorithms.</w:t>
+        <w:t>Python 3.10+, ScanPy 1.12, NetworkX 3.6, NumPy, SciPy, and scikit-learn were used; total compute was approximately 12 minutes (Intel i9-13900K, 64 GB RAM). Full pipeline and processed data are at https://github.com/yyx-4113/ra-painkg [19]. During manuscript preparation the author used AI-assisted tools (OpenAI Codex CLI, GitHub Copilot, and Claude via API) for code development, literature search, and language editing. All AI-generated content was reviewed and verified by the author, who takes full responsibility for scientific accuracy, data integrity, and conclusions. No AI tool contributed to data generation or statistical computation beyond executing author-specified algorithms.</w:t>
       </w:r>
     </w:p>
     <w:p>
@@ -262,7 +262,7 @@
     </w:p>
     <w:p>
       <w:r>
-        <w:t>All nine curated pathways mapped onto RA-PainKG at 57% (complement cascade) to 100% (TRP channels, voltage-gated sodium channels, neurotrophin signaling) gene coverage. The 165 annotated genes span 20 functional categories (Supplementary Table S1). Track A comprises 106 genes and Track B 122, with 96 (58.2%) overlapping both. This substantial overlap is biologically expected: transcription factors (FOS, JUN, STAT3) activated by inflammatory cytokines also drive nociceptive sensitization, MAP kinases transduce both inflammatory and pain signals, and prostaglandins (via COX-2/PTGS2) bridge immune activation and nociceptor sensitization [5,7]. The dual-track framework is a conceptual lens for hypothesis generation: genes exclusive to one track may mark intervention points where anti-inflammatory and analgesic effects partially decouple, whereas dual-track hubs are convergence nodes.</w:t>
+        <w:t>All nine curated pathways mapped onto RA-PainKG at 57% (complement cascade) to 100% (TRP channels, voltage-gated sodium channels, neurotrophin signaling) gene coverage. The 165 annotated genes span 20 functional categories (Supplementary Table S1). Track A comprises 106 genes and Track B 122, with 96 (58.2%) overlapping both (a further 33 annotated genes were assigned to neither track and are pending further curation). This substantial overlap is biologically expected: transcription factors (FOS, JUN, STAT3) activated by inflammatory cytokines also drive nociceptive sensitization, MAP kinases transduce both inflammatory and pain signals, and prostaglandins (via COX-2/PTGS2) bridge immune activation and nociceptor sensitization [5,7]. The dual-track framework is a conceptual lens for hypothesis generation: genes exclusive to one track may mark intervention points where anti-inflammatory and analgesic effects partially decouple, whereas dual-track hubs are convergence nodes.</w:t>
       </w:r>
     </w:p>
     <w:p>
@@ -275,45 +275,12 @@
     </w:p>
     <w:p>
       <w:r>
-        <w:t>Of 192 curated genes, 189 (98.4%) matched PrimeKG symbols exactly; 188 of 192 are present in the final graph. No curated gene is genuinely absent — the only non-recoveries are identifier/symbol artifacts plus one construction artifact:</w:t>
-      </w:r>
-    </w:p>
-    <w:p>
-      <w:pPr>
-        <w:pStyle w:val="ListBullet"/>
-      </w:pPr>
-      <w:r>
-        <w:rPr>
-          <w:b/>
-        </w:rPr>
-        <w:t>Identifier/symbol artifacts (3 genes):</w:t>
-      </w:r>
-      <w:r>
-        <w:t xml:space="preserve"> ACPA (an autoantibody marker, not a gene symbol), NAPE-PLD (resolves to NAPEPLD), and RANKL (resolves to TNFSF11).</w:t>
-      </w:r>
-    </w:p>
-    <w:p>
-      <w:pPr>
-        <w:pStyle w:val="ListBullet"/>
-      </w:pPr>
-      <w:r>
-        <w:rPr>
-          <w:b/>
-        </w:rPr>
-        <w:t>Construction artifact (1 gene):</w:t>
-      </w:r>
-      <w:r>
-        <w:t xml:space="preserve"> ADRA2B is present in PrimeKG but was not retained in the final graph; it can be re-included in a future release.</w:t>
+        <w:t>Of 192 curated genes, 189 (98.4%) matched PrimeKG symbols exactly; 188 of 192 are present in the final graph by exact symbol. Applying alias resolution, all 192 curated entries are represented in PrimeKG: NAPE-PLD and RANKL are present under the HGNC symbols NAPEPLD and TNFSF11, respectively, and ADRA2B is present but was not retained in the final graph during construction. ACPA is an autoantibody marker rather than a gene symbol. No curated gene is therefore genuinely absent from the underlying knowledge base; the only residual items are (i) one construction artifact (ADRA2B, re-includable in a future release) and (ii) identifier/alias notes (ACPA; NAPE-PLD→NAPEPLD; RANKL→TNFSF11). The principal added value of RA-PainKG is therefore not the recovery of absent genes, but the organization, tissue contextualization, and transparent annotation of an already well-covered gene set.</w:t>
       </w:r>
     </w:p>
     <w:p>
       <w:r>
-        <w:t>Thus the effective coverage gap is negligible: 188/192 genes are present, and the remaining four are identifier or construction artifacts rather than biological absences. The principal added value of RA-PainKG is therefore not the recovery of absent genes, but the organization, tissue contextualization, and transparent annotation of an already well-covered gene set.</w:t>
-      </w:r>
-    </w:p>
-    <w:p>
-      <w:r>
-        <w:t>A secondary structural asymmetry remains. Within the 120 core genes that received dual-track annotations, 50% of Track B (nociception-specific) genes have zero PPI edges in the PPI subgraph, versus 20% of Track A (inflammation) genes. Nociception-specific prior knowledge is thus sparser in direct connectivity than inflammation-specific prior knowledge — a gap future edge curation should target.</w:t>
+        <w:t>A secondary structural asymmetry remains. Among the 122 Track B genes, 50% have zero PPI edges in the PPI subgraph, versus 20% of the 106 Track A genes. Nociception-specific prior knowledge is thus sparser in direct connectivity than inflammation-specific prior knowledge — a gap future edge curation should target.</w:t>
       </w:r>
     </w:p>
     <w:p>
@@ -331,7 +298,7 @@
     </w:p>
     <w:p>
       <w:r>
-        <w:t>Two findings are relevant. First, RA-PainKG is 280-fold sparser than GO (2,400 vs 673,899 PPI edges), with 68.3% of Norman genes having zero edges. Among 44 pain genes present in Norman (26.7% of 165 annotated), 59.1% (26/44) show mean K562 expression below 0.01, and mean pain-gene expression (0.117) is comparable to the genome-wide background (0.107). These data establish that K562 performance reflects test-system limitations, not resource quality (see Discussion).</w:t>
+        <w:t>Two findings are relevant. First, RA-PainKG is 280-fold sparser than GO (2,400 vs 673,899 PPI edges in their respective benchmark PPI variants), with 68.3% of Norman genes having zero edges. Among 44 pain genes present in Norman (26.7% of 165 annotated), 59.1% (26/44) show mean K562 expression below 0.01, and mean pain-gene expression (0.117) is comparable to the genome-wide background (0.107). These data establish that K562 performance reflects test-system limitations, not resource quality (see Discussion).</w:t>
       </w:r>
     </w:p>
     <w:p>
@@ -393,7 +360,7 @@
     </w:p>
     <w:p>
       <w:r>
-        <w:t>The benchmark also reveals that single-split evaluation produces artifacts (seed 42: RA-PainKG r = 0.558 vs GO 0.481; multi-split average: 0.503 vs 0.542). This demonstrates the necessity of multi-split statistics for reliable knowledge-graph evaluation — a finding applying to any domain-specific KG benchmark.</w:t>
+        <w:t>The benchmark also reveals that single-split evaluation produces artifacts (seed 42: RA-PainKG r = 0.558 vs GO 0.481; multi-split average: 0.503 vs 0.542). This demonstrates the necessity of multi-split statistics for reliable knowledge-graph evaluation — a finding applying to any domain-specific KG benchmark. Importantly, the multi-split comparison is not directly comparable across knowledge graphs because RA-PainKG was evaluated on a 265-gene vocabulary while GO and STRING were evaluated on a 2,000-gene vocabulary; the appropriate reference is the within-vocabulary null. Within the 265-gene vocabulary, random graphs and a degree-preserving random rewiring of RA-PainKG both matched or exceeded RA-PainKG's predictive performance (random vs RA-PainKG Δr = +0.115, p &lt; 0.001; RA-PainKG vs degree-preserved Δr = +0.005, p = 0.83; Supplementary Table S4). RA-PainKG therefore confers no predictive advantage over a structureless or degree-matched null on this task; we report this transparently as a boundary condition, not as evidence of resource quality.</w:t>
       </w:r>
     </w:p>
     <w:p>
@@ -481,6 +448,20 @@
     </w:p>
     <w:p>
       <w:pPr>
+        <w:pStyle w:val="ListBullet"/>
+      </w:pPr>
+      <w:r>
+        <w:rPr>
+          <w:b/>
+        </w:rPr>
+        <w:t>Curation completeness:</w:t>
+      </w:r>
+      <w:r>
+        <w:t xml:space="preserve"> The initial 192-gene set omits two canonically implicated pain/analgesia genes, DRD2 and COMT, which should be incorporated in a future release; the nine curated pathways are enumerated in Stage 1 to support reproducibility.</w:t>
+      </w:r>
+    </w:p>
+    <w:p>
+      <w:pPr>
         <w:pStyle w:val="Heading2"/>
       </w:pPr>
       <w:r>
@@ -502,7 +483,7 @@
     </w:p>
     <w:p>
       <w:r>
-        <w:t>RA-PainKG provides a tissue-contextualized, dual-track knowledge graph for RA pain signaling with transparent recovery and gap documentation — a resource type not previously available for pain biology. It recovers 188/192 (97.9%) of curated pain genes, maps all nine pathways (57–100% coverage), and provides 4,760 drug–target edges for pharmacological queries. Transparent benchmark validation establishes honest boundary conditions for downstream use. The open-source construction framework is extensible to other diseases where domain-specific knowledge graphs with documented recovery and gaps would accelerate mechanistic research.</w:t>
+        <w:t>RA-PainKG provides a transparently documented, tissue-contextualized, dual-track knowledge graph for RA pain signaling. It recovers 188/192 (97.9%) of curated pain genes, maps all nine pathways (57–100% coverage), and provides 4,760 drug–target edges for pharmacological queries. Transparent benchmark validation establishes honest boundary conditions for downstream use, including that graph structure adds little beyond node degree and edge density on the K562 test system. The open-source construction framework is extensible to other diseases where domain-specific knowledge graphs with documented recovery and gaps would accelerate mechanistic research.</w:t>
       </w:r>
     </w:p>
     <w:p>

</xml_diff>

<commit_message>
Round 2 independent panel review: fix zero-PPI (24.6%/17.9%), COMT/DRD2, 9-pathway enumeration, entity types, STRING r, leakage stmt, title, [19] citation, Vancouver reference renumber
</commit_message>
<xml_diff>
--- a/submission_BMC/manuscript_BMC.docx
+++ b/submission_BMC/manuscript_BMC.docx
@@ -11,7 +11,7 @@
           <w:b/>
           <w:sz w:val="30"/>
         </w:rPr>
-        <w:t>RA-PainKG: a tissue-contextualized knowledge graph for rheumatoid arthritis pain signaling with benchmark validation</w:t>
+        <w:t>RA-PainKG: a tissue-contextualized knowledge graph for rheumatoid arthritis pain signaling with transparent benchmark characterization</w:t>
       </w:r>
     </w:p>
     <w:p>
@@ -112,12 +112,12 @@
     </w:p>
     <w:p>
       <w:r>
-        <w:t>Existing resources have critical limitations for pain mechanism research. STRING [8] and BioGRID [9] provide comprehensive protein–protein interaction data but lack tissue specificity, directionality, and drug–target annotations. KEGG [10], Reactome [11], and WikiPathways [12] offer curated pathway models without tissue contextualization. PrimeKG [13] integrates 20 biomedical resources into a unified multimodal knowledge graph, a major advance, yet remains a general-purpose resource: it does not separate pain-specific signaling from inflammatory pathways, lacks tissue-expression filtering, and provides no systematic mapping of curated pain gene sets. Pain-focused resources such as the IUPHAR/BPS Guide to Pharmacology [14] and the Human Pain Genetics Database [15] curate pain-relevant genes, while DisGeNET [17] provides gene–disease associations, but these lack network connectivity and multi-entity integration.</w:t>
+        <w:t>Existing resources have critical limitations for pain mechanism research. STRING [8] and BioGRID [9] provide comprehensive protein–protein interaction data but lack tissue specificity, directionality, and drug–target annotations. KEGG [10], Reactome [11], and WikiPathways [12] offer curated pathway models without tissue contextualization. PrimeKG [13] integrates 20 biomedical resources into a unified multimodal knowledge graph, a major advance, yet remains a general-purpose resource: it does not separate pain-specific signaling from inflammatory pathways, lacks tissue-expression filtering, and provides no systematic mapping of curated pain gene sets. Pain-focused resources such as the IUPHAR/BPS Guide to Pharmacology [14] and the Human Pain Genetics Database [15] curate pain-relevant genes, while DisGeNET [16] provides gene–disease associations, but these lack network connectivity and multi-entity integration.</w:t>
       </w:r>
     </w:p>
     <w:p>
       <w:r>
-        <w:t>The consequence is a fragmented landscape: researchers must choose between general-purpose knowledge graphs that lack pain-specific organization or pain-specific gene lists that lack network structure. A resource integrating curated pain gene annotations with multimodal network data, providing tissue-contextual filtering and transparently documenting recovery and residual gaps, would fill a well-defined need. We present RA-PainKG, a tissue-contextualized dual-track knowledge graph integrating PrimeKG v1.0 [13] with GTEx v8 tissue-expression data [16] and manual curation of 192 pain-relevant genes in 20 functional categories spanning nine core pain signaling pathways.</w:t>
+        <w:t>The consequence is a fragmented landscape: researchers must choose between general-purpose knowledge graphs that lack pain-specific organization or pain-specific gene lists that lack network structure. A resource integrating curated pain gene annotations with multimodal network data, providing tissue-contextual filtering and transparently documenting recovery and residual gaps, would fill a well-defined need. We present RA-PainKG, a tissue-contextualized dual-track knowledge graph integrating PrimeKG v1.0 [13] with GTEx v8 tissue-expression data [17] and manual curation of 192 pain-relevant genes in 20 functional categories spanning nine core pain signaling pathways.</w:t>
       </w:r>
     </w:p>
     <w:p>
@@ -149,7 +149,7 @@
         <w:t>Stage 1: Core gene curation.</w:t>
       </w:r>
       <w:r>
-        <w:t xml:space="preserve"> 192 pain genes were manually curated from 20 literature-defined functional categories: nociceptor transduction channels, voltage-gated sodium and calcium channels, neuropeptide signaling, neurotrophin signaling, the opioid system, inflammatory cytokines and receptors, MAPK, JAK–STAT, and NF-κB pathways, the prostaglandin pathway, complement cascade, GABA/glycine and serotonin receptors, the endocannabinoid system, kinase signaling, transcription factors, RA-specific genes, and anesthetic targets. These 20 categories were organized into nine core pain signaling pathways — (1) nociceptor transduction (TRP and voltage-gated channels), (2) synaptic transmission (neuropeptide and neurotrophin signaling), (3) the opioid system, (4) inflammatory cytokine signaling (cytokines, receptors, JAK–STAT, NF-κB, MAPK), (5) prostaglandin signaling, (6) complement cascade, (7) inhibitory modulation (GABA/glycine, serotonin, endocannabinoid), (8) kinase signaling, and (9) RA-specific and anesthetic-target pathways — enumerated explicitly to aid reproducibility. Inclusion required (1) published experimental evidence for a role in pain signaling, nociception, or RA inflammation in at least two independent studies (PubMed: "gene_symbol AND (pain OR nociception OR rheumatoid arthritis)"), or (2) designation as a known analgesic or RA drug target in the IUPHAR/BPS Guide to Pharmacology [14] or DrugBank. The full list with functional assignments and PMIDs is in Supplementary Table S1.</w:t>
+        <w:t xml:space="preserve"> 192 pain genes were manually curated from 20 literature-defined functional categories: nociceptor transduction channels, voltage-gated sodium and calcium channels, neuropeptide signaling, neurotrophin signaling, the opioid system, inflammatory cytokines and receptors, MAPK, JAK–STAT, and NF-κB pathways, the prostaglandin pathway, complement cascade, GABA/glycine and serotonin receptors, the endocannabinoid system, kinase signaling, transcription factors, RA-specific genes, and anesthetic targets. These 20 categories were organized into nine core pain signaling pathways — (1) the TRPV1–CGRP nociceptor axis, (2) the Nav1.7 sodium-channel action-potential axis, (3) the TNFα–NGF inflammatory pain axis, (4) the opioid endogenous-analgesia axis, (5) the JAK–STAT RA-inflammatory axis, (6) the MAPK pain-sensitization axis, (7) the complement neuroimmune axis, (8) GABAergic descending inhibition, and (9) the prostaglandin inflammatory-mediator axis — enumerated explicitly to aid reproducibility. Inclusion required (1) published experimental evidence for a role in pain signaling, nociception, or RA inflammation in at least two independent studies (PubMed: "gene_symbol AND (pain OR nociception OR rheumatoid arthritis)"), or (2) designation as a known analgesic or RA drug target in the IUPHAR/BPS Guide to Pharmacology [14] or DrugBank. The full list with functional assignments and PMIDs is in Supplementary Table S1.</w:t>
       </w:r>
     </w:p>
     <w:p>
@@ -160,7 +160,7 @@
         <w:t>Stage 2: PrimeKG integration and track assignment.</w:t>
       </w:r>
       <w:r>
-        <w:t xml:space="preserve"> Of 192 curated genes, 189 (98.4%) matched PrimeKG v1.0 node symbols by exact, case-insensitive matching; 188 of 192 are present in the final RA-PainKG graph by exact symbol (one matched gene, ADRA2B, was not retained during construction). The pipeline identified 190 seed gene/protein nodes; 120 of the 192 curated genes were retained as the curated core of the annotated set. A 2-hop neighborhood expansion with a connectivity filter (nodes reachable from at least two seed categories) added 45 additional pain-relevant genes (e.g., CCR6, CSF2, IRF5, IFNG, FCGR3A), yielding a final annotated set of 165 genes (120 curated + 45 expansion). Of the 192 curated genes, 72 were not retained in the dual-track annotated set; 68 of these are present in the graph but were not assigned dual-track annotations, and 4 are identifier/construction artifacts (see Recovery and residual-gap analysis). Among the 165 annotated genes, 106 were assigned to Track A (immune-inflammation), 122 to Track B (nociception–pain transduction), with 96 in both; 33 annotated genes were assigned to neither track pending further curation.</w:t>
+        <w:t xml:space="preserve"> Of 192 curated genes, 189 (98.4%) matched PrimeKG v1.0 node symbols by exact, case-insensitive matching; 188 of 192 are present in the final RA-PainKG graph by exact symbol (one matched gene, ADRA2B, was not retained during construction). The pipeline identified 190 seed gene/protein nodes; 120 of the 192 curated genes were retained as the curated core of the annotated set. A 2-hop neighborhood expansion with a connectivity filter (nodes reachable from at least two seed categories) added 45 additional pain-relevant genes (e.g., CCR6, CSF2, IRF5, IFNG, FCGR3A), yielding a final annotated set of 165 genes (120 curated + 45 expansion). Of the 192 curated genes, 72 were not retained in the dual-track annotated set; 68 of these are present in the graph but were not assigned dual-track annotations, and 4 are identifier or construction artifacts (ACPA is a non-gene autoantibody marker; NAPE-PLD and RANKL are present under the aliases NAPEPLD and TNFSF11; ADRA2B is a construction artifact — all resolved in the Recovery and residual-gap analysis). Among the 165 annotated genes, 106 were assigned to Track A (immune-inflammation), 122 to Track B (nociception–pain transduction), with 96 in both; 33 annotated genes were assigned to neither track pending further curation.</w:t>
       </w:r>
     </w:p>
     <w:p>
@@ -171,7 +171,7 @@
         <w:t>Tissue-contextual filtering.</w:t>
       </w:r>
       <w:r>
-        <w:t xml:space="preserve"> GTEx v8 median tissue-expression data [16] annotated each pain gene across 54 human tissues. For nociception-relevant compartments we used spinal cord (cervical C1), tibial nerve, whole blood, and spleen as proxies. A gene was classified as tissue-expressed at median TPM ≥ 1.0, following standard GTEx thresholds [16]. These annotations are node attributes in the GraphML and CSV formats but were not used to filter edges in the current release, because removing edges on bulk tissue expression risks discarding valid low-expression interactions; future versions will incorporate single-cell data.</w:t>
+        <w:t xml:space="preserve"> GTEx v8 median tissue-expression data [17] annotated each pain gene across 54 human tissues. For nociception-relevant compartments we used spinal cord (cervical C1), tibial nerve, whole blood, and spleen as proxies. A gene was classified as tissue-expressed at median TPM ≥ 1.0, following standard GTEx thresholds [17]. These annotations are node attributes in the GraphML and CSV formats but were not used to filter edges in the current release, because removing edges on bulk tissue expression risks discarding valid low-expression interactions; future versions will incorporate single-cell data.</w:t>
       </w:r>
     </w:p>
     <w:p>
@@ -200,7 +200,7 @@
     </w:p>
     <w:p>
       <w:r>
-        <w:t>For benchmark validation, gene–gene adjacency matrices for 5,045 Norman genes were computed across 11 knowledge-graph variants in three factor categories: (A) Density factor — GO-BP (673,899 edges, density 0.0265), five random realizations, GO-painCentric (edges with ≥1 pain-gene endpoint, 121,543 edges, density 0.0048), RA-PainKG (2,400 PPI edges, density 0.00009), and an Identity matrix; (B) Domain specificity factor — RA-PainKG gene nodes (type "gene/protein") extracted and HGNC-matched, retaining only PPI edges; the pain gene pool for GO-painCentric defined as the 44 pain-annotated genes present in the Norman vocabulary; of 5,045 Norman genes, 1,600 (31.7%) have ≥1 edge in RA-PainKG; (C) Structural topology factor (ablations) — RA-PainKG-degPreserved (degree-preserving rewiring) and GO-painCentric tested whether edge identity or degree distribution drives performance; STRING PPI v12 was the 11th variant but yielded zero predictive signal (r = 0.000 on all subsets), attributed to ENSP-to-symbol mapping ambiguity at the 5,045-gene scale.</w:t>
+        <w:t>For benchmark validation, gene–gene adjacency matrices for 5,045 Norman genes were computed across 11 knowledge-graph variants in three factor categories: (A) Density factor — GO-BP (673,899 edges, density 0.0265), five random realizations, GO-painCentric (edges with ≥1 pain-gene endpoint, 121,543 edges, density 0.0048), RA-PainKG (2,400 PPI edges, density 0.00009), and an Identity matrix; (B) Domain specificity factor — RA-PainKG gene nodes (type "gene/protein") extracted and HGNC-matched, retaining only PPI edges; the pain gene pool for GO-painCentric defined as the 44 pain-annotated genes present in the Norman vocabulary; of 5,045 Norman genes, 1,600 (31.7%) have ≥1 edge in RA-PainKG; (C) Structural topology factor (ablations) — RA-PainKG-degPreserved (degree-preserving rewiring) and GO-painCentric tested whether edge identity or degree distribution drives performance; STRING PPI v12 was the 11th variant but yielded negligible predictive signal (overall Pearson r = 0.0003; pain-gene subset r = 0.0008), attributed to ENSP-to-symbol mapping ambiguity at the 5,045-gene scale.</w:t>
       </w:r>
     </w:p>
     <w:p>
@@ -213,12 +213,12 @@
     </w:p>
     <w:p>
       <w:r>
-        <w:t>The Norman et al. Perturb-seq dataset (DOI: 10.7910/DVN/R9JDLS) profiles CRISPRi in K562 chronic myeloid leukemia cells [20]. The processed file (perturb_processed.h5ad, 2.2 GB; Harvard Dataverse datafile 6154020) contains 5,045 genes across 91,205 cells with 284 perturbation conditions. We aggregate cells by condition to compute mean post-perturbation expression changes (delta = condition_mean − ctrl_mean); control expression variance is 0.194 (SD 0.441) from log-normalized values.</w:t>
+        <w:t>The Norman et al. Perturb-seq dataset (DOI: 10.7910/DVN/R9JDLS) profiles CRISPRi in K562 chronic myeloid leukemia cells [18]. The processed file (perturb_processed.h5ad, 2.2 GB; Harvard Dataverse datafile 6154020) contains 5,045 genes across 91,205 cells with 284 perturbation conditions. We aggregate cells by condition to compute mean post-perturbation expression changes (delta = condition_mean − ctrl_mean); control expression variance is 0.194 (SD 0.441) from log-normalized values.</w:t>
       </w:r>
     </w:p>
     <w:p>
       <w:r>
-        <w:t>For validation, 128-dimensional gene embeddings were computed via spectral decomposition of the normalized graph Laplacian (k = 128) for each KG. Perturbation effects were predicted by ridge regression (λ = 0.1) across 10 independent train/test splits (80%/20%). This linear architecture isolates KG contribution from model capacity. Paired t-tests with Bonferroni correction (α = 0.01, m = 5) and Kendall's W ranked consistency were used for comparison. Sensitivity analyses for regularization (α = 0.001–100.0) and embedding dimension (k = 32–512) confirmed robustness. K562 pain-gene expression was quantified for all 44 pain-annotated genes. Full methods, including spectral decomposition details, nonlinear model comparison (MLP vs ridge), GEARS architecture comparison [21], evaluation protocol, and power analysis, are in Supplementary Methods.</w:t>
+        <w:t>For validation, 128-dimensional gene embeddings were computed via spectral decomposition of the normalized graph Laplacian (k = 128) for each KG. Perturbation effects were predicted by ridge regression (λ = 0.1) across 10 independent train/test splits (80%/20%). This linear architecture isolates KG contribution from model capacity. Paired t-tests with Bonferroni correction (α = 0.01, m = 5) and Kendall's W ranked consistency were used for comparison. Sensitivity analyses for regularization (α = 0.001–100.0) and embedding dimension (k = 32–512) confirmed robustness. K562 pain-gene expression was quantified for all 44 pain-annotated genes. Full methods, including spectral decomposition details, nonlinear model comparison (MLP vs ridge), GEARS architecture comparison [19], evaluation protocol, and power analysis, are in Supplementary Methods.</w:t>
       </w:r>
     </w:p>
     <w:p>
@@ -231,7 +231,7 @@
     </w:p>
     <w:p>
       <w:r>
-        <w:t>Python 3.10+, ScanPy 1.12, NetworkX 3.6, NumPy, SciPy, and scikit-learn were used; total compute was approximately 12 minutes (Intel i9-13900K, 64 GB RAM). Full pipeline and processed data are at https://github.com/yyx-4113/ra-painkg [19]. During manuscript preparation the author used AI-assisted tools (OpenAI Codex CLI, GitHub Copilot, and Claude via API) for code development, literature search, and language editing. All AI-generated content was reviewed and verified by the author, who takes full responsibility for scientific accuracy, data integrity, and conclusions. No AI tool contributed to data generation or statistical computation beyond executing author-specified algorithms.</w:t>
+        <w:t>Python 3.10+, ScanPy 1.12, NetworkX 3.6, NumPy, SciPy, and scikit-learn were used; total compute was approximately 12 minutes (Intel i9-13900K, 64 GB RAM). Full pipeline and processed data are at https://github.com/yyx-4113/ra-painkg [20]. During manuscript preparation the author used AI-assisted tools (OpenAI Codex CLI, GitHub Copilot, and Claude via API) for code development, literature search, and language editing. All AI-generated content was reviewed and verified by the author, who takes full responsibility for scientific accuracy, data integrity, and conclusions. No AI tool contributed to data generation or statistical computation beyond executing author-specified algorithms.</w:t>
       </w:r>
     </w:p>
     <w:p>
@@ -257,7 +257,7 @@
     </w:p>
     <w:p>
       <w:r>
-        <w:t>The graph spans 10 entity types (gene/protein, drug, disease, pathway, biological process, molecular function, cellular component, anatomy, phenotype) and 24 relation types; 4,760 drug–target edges enable direct pharmacological queries. Betweenness centrality identified EGR1, FOS, STAT3, AKT1, and SRC as the top five hubs (Figure 1); the degree distribution follows a scale-free pattern (Figure 2).</w:t>
+        <w:t>The graph spans 10 entity types (gene/protein, drug, disease, pathway, biological process, molecular function, cellular component, anatomy, phenotype, and exposure) and 24 relation types; 4,760 drug–target edges enable direct pharmacological queries. Betweenness centrality identified EGR1, FOS, STAT3, AKT1, and SRC as the top five hubs (Figure 1); the degree distribution follows a scale-free pattern (Figure 2).</w:t>
       </w:r>
     </w:p>
     <w:p>
@@ -280,7 +280,7 @@
     </w:p>
     <w:p>
       <w:r>
-        <w:t>A secondary structural asymmetry remains. Among the 122 Track B genes, 50% have zero PPI edges in the PPI subgraph, versus 20% of the 106 Track A genes. Nociception-specific prior knowledge is thus sparser in direct connectivity than inflammation-specific prior knowledge — a gap future edge curation should target.</w:t>
+        <w:t>A secondary structural asymmetry remains. Within the protein–protein interaction (PPI) subgraph induced by the 165 annotated genes (780 PPI edges), 24.6% of Track B genes (30/122) and 17.9% of Track A genes (19/106) have no PPI edges. Nociception-specific prior knowledge is thus sparser in direct connectivity than inflammation-specific prior knowledge — a gap future edge curation should target.</w:t>
       </w:r>
     </w:p>
     <w:p>
@@ -293,7 +293,7 @@
     </w:p>
     <w:p>
       <w:r>
-        <w:t>Validation used the Norman K562 Perturb-seq dataset [20] (91,205 cells, 5,045 genes, 284 CRISPRi conditions). Embeddings via spectral decomposition (k = 128) and ridge regression across 10 splits (80%/20%) yielded full results in Supplementary Tables S1–S6.</w:t>
+        <w:t>Validation used the Norman K562 Perturb-seq dataset [18] (91,205 cells, 5,045 genes, 284 CRISPRi conditions). Embeddings via spectral decomposition (k = 128) and ridge regression across 10 splits (80%/20%) yielded full results in Supplementary Tables S1–S6.</w:t>
       </w:r>
     </w:p>
     <w:p>
@@ -355,12 +355,12 @@
     </w:p>
     <w:p>
       <w:r>
-        <w:t>Benchmark validation across 11 KG variants [20] provides transparent performance characterization (Supplementary Tables S4–S5). K562 cells were selected not as a biologically appropriate test system for RA pain (they are not), but as the most extensively characterized publicly available genome-scale Perturb-seq dataset with sufficient perturbation diversity for multi-split benchmarking. The purpose is to characterize the resource's predictive properties in a standardized setting and establish baselines against which future disease-relevant evaluations can be compared. K562 cells are fundamentally mismatched to RA pain biology: 59.1% of measurable pain genes show mean expression below 0.01, and only 26.7% of RA-PainKG pain genes (44/165) are present in Norman. Perturbation-prediction performance on K562 should therefore not be interpreted as a measure of RA-PainKG's biological validity — it reflects test-system limitations.</w:t>
+        <w:t>Benchmark validation across 11 KG variants [18] provides transparent performance characterization (Supplementary Tables S4–S5). K562 cells were selected not as a biologically appropriate test system for RA pain (they are not), but as the most extensively characterized publicly available genome-scale Perturb-seq dataset with sufficient perturbation diversity for multi-split benchmarking. The purpose is to characterize the resource's predictive properties in a standardized setting and establish baselines against which future disease-relevant evaluations can be compared. K562 cells are fundamentally mismatched to RA pain biology: 59.1% of measurable pain genes show mean expression below 0.01, and only 26.7% of RA-PainKG pain genes (44/165) are present in Norman. Perturbation-prediction performance on K562 should therefore not be interpreted as a measure of RA-PainKG's biological validity — it reflects test-system limitations.</w:t>
       </w:r>
     </w:p>
     <w:p>
       <w:r>
-        <w:t>The benchmark also reveals that single-split evaluation produces artifacts (seed 42: RA-PainKG r = 0.558 vs GO 0.481; multi-split average: 0.503 vs 0.542). This demonstrates the necessity of multi-split statistics for reliable knowledge-graph evaluation — a finding applying to any domain-specific KG benchmark. Importantly, the multi-split comparison is not directly comparable across knowledge graphs because RA-PainKG was evaluated on a 265-gene vocabulary while GO and STRING were evaluated on a 2,000-gene vocabulary; the appropriate reference is the within-vocabulary null. Within the 265-gene vocabulary, random graphs and a degree-preserving random rewiring of RA-PainKG both matched or exceeded RA-PainKG's predictive performance (random vs RA-PainKG Δr = +0.115, p &lt; 0.001; RA-PainKG vs degree-preserved Δr = +0.005, p = 0.83; Supplementary Table S4). RA-PainKG therefore confers no predictive advantage over a structureless or degree-matched null on this task; we report this transparently as a boundary condition, not as evidence of resource quality.</w:t>
+        <w:t>The benchmark also reveals that single-split evaluation produces artifacts (seed 42: RA-PainKG r = 0.558 vs GO 0.481; multi-split average: 0.503 vs 0.542). This demonstrates the necessity of multi-split statistics for reliable knowledge-graph evaluation — a finding applying to any domain-specific KG benchmark. Importantly, the multi-split comparison is not directly comparable across knowledge graphs because RA-PainKG was evaluated on a 265-gene vocabulary while GO and STRING were evaluated on a 2,000-gene vocabulary; the appropriate reference is the within-vocabulary null. Note also that RA-PainKG's 265-gene benchmark vocabulary is drawn from its own construction genes (the 44 annotated genes present in Norman plus their PPI neighbours), so this benchmark is an in-construction sanity check rather than an independent external evaluation; this overlap limits claims of external generalizability. Within the 265-gene vocabulary, random graphs and a degree-preserving random rewiring of RA-PainKG both matched or exceeded RA-PainKG's predictive performance (random vs RA-PainKG Δr = +0.115, p &lt; 0.001; RA-PainKG vs degree-preserved Δr = +0.005, p = 0.83; Supplementary Table S4). RA-PainKG therefore confers no predictive advantage over a structureless or degree-matched null on this task; we report this transparently as a boundary condition, not as evidence of resource quality.</w:t>
       </w:r>
     </w:p>
     <w:p>
@@ -387,7 +387,7 @@
         <w:t>Tissue coverage:</w:t>
       </w:r>
       <w:r>
-        <w:t xml:space="preserve"> GTEx v8 lacks dorsal root ganglion (DRG) and synovium; we proxy DRG via spinal cord and tibial nerve, immune compartments via whole blood and spleen. Human DRG single-cell RNA-seq [18] could improve resolution.</w:t>
+        <w:t xml:space="preserve"> GTEx v8 lacks dorsal root ganglion (DRG) and synovium; we proxy DRG via spinal cord and tibial nerve, immune compartments via whole blood and spleen. Human DRG single-cell RNA-seq [21] could improve resolution.</w:t>
       </w:r>
     </w:p>
     <w:p>
@@ -457,7 +457,7 @@
         <w:t>Curation completeness:</w:t>
       </w:r>
       <w:r>
-        <w:t xml:space="preserve"> The initial 192-gene set omits two canonically implicated pain/analgesia genes, DRD2 and COMT, which should be incorporated in a future release; the nine curated pathways are enumerated in Stage 1 to support reproducibility.</w:t>
+        <w:t xml:space="preserve"> The initial 192-gene curation omits the canonically implicated analgesia gene DRD2 (descending dopaminergic analgesia), which should be incorporated in a future release. COMT, another frequently cited human pain-genetics locus, was recovered through the 2-hop expansion rather than the original curation and is therefore represented in the annotated set; the nine curated pathways are enumerated in Stage 1 to support reproducibility.</w:t>
       </w:r>
     </w:p>
     <w:p>
@@ -768,32 +768,32 @@
     </w:p>
     <w:p>
       <w:r>
-        <w:t>[16] GTEx Consortium. The GTEx Consortium atlas of genetic regulatory effects across human tissues. Science. 2020;369(6509):1318–1330.</w:t>
+        <w:t>[16] Pinero J, Ramirez-Anguita JM, Sauch-Pitarch J, et al. The DisGeNET knowledge platform for disease genomics: 2019 update. Nucleic Acids Res. 2020;48(D1):D845–D855.</w:t>
       </w:r>
     </w:p>
     <w:p>
       <w:r>
-        <w:t>[17] Pinero J, Ramirez-Anguita JM, Sauch-Pitarch J, et al. The DisGeNET knowledge platform for disease genomics: 2019 update. Nucleic Acids Res. 2020;48(D1):D845–D855.</w:t>
+        <w:t>[17] GTEx Consortium. The GTEx Consortium atlas of genetic regulatory effects across human tissues. Science. 2020;369(6509):1318–1330.</w:t>
       </w:r>
     </w:p>
     <w:p>
       <w:r>
-        <w:t>[18] Nguyen MQ, von Buchholtz LJ, Reker AN, Ryba NJ, Davidson S. Single-nucleus transcriptomic analysis of human dorsal root ganglion sensory neurons. Pain. 2021;162(7):2032–2046.</w:t>
+        <w:t>[18] Norman TM, Horlbeck MA, Replogle JM, et al. Exploring genetic interaction manifolds constructed from rich single-cell phenotypes. Science. 2019;365(6455):786–793.</w:t>
       </w:r>
     </w:p>
     <w:p>
       <w:r>
-        <w:t>[19] Yang Y. RA-PainKG: A tissue-specific knowledge graph for rheumatoid arthritis pain signaling — construction protocol, network analysis, and coverage-gap documentation. GitHub/Zenodo. 2026. Available at: https://github.com/yyx-4113/ra-painkg.</w:t>
+        <w:t>[19] Roohani Y, Huang K, Leskovec J. Predicting transcriptional outcomes of novel multigene perturbations with GEARS. Nat Biotechnol. 2024;42:591–600.</w:t>
       </w:r>
     </w:p>
     <w:p>
       <w:r>
-        <w:t>[20] Norman TM, Horlbeck MA, Replogle JM, et al. Exploring genetic interaction manifolds constructed from rich single-cell phenotypes. Science. 2019;365(6455):786–793.</w:t>
+        <w:t>[20] Yang Y. RA-PainKG: A tissue-specific knowledge graph for rheumatoid arthritis pain signaling — construction protocol, network analysis, and coverage-gap documentation. GitHub. 2026. Available at: https://github.com/yyx-4113/ra-painkg.</w:t>
       </w:r>
     </w:p>
     <w:p>
       <w:r>
-        <w:t>[21] Roohani Y, Huang K, Leskovec J. Predicting transcriptional outcomes of novel multigene perturbations with GEARS. Nat Biotechnol. 2024;42:591–600.</w:t>
+        <w:t>[21] Nguyen MQ, von Buchholtz LJ, Reker AN, Ryba NJ, Davidson S. Single-nucleus transcriptomic analysis of human dorsal root ganglion sensory neurons. Pain. 2021;162(7):2032–2046.</w:t>
       </w:r>
     </w:p>
     <w:p>

</xml_diff>

<commit_message>
Round 3 integrity fix: correct 265-vocab decomposition (165 annotated +100, 0 external), disambiguate 44/165 as measurably-expressed, deposit composition in S6
</commit_message>
<xml_diff>
--- a/submission_BMC/manuscript_BMC.docx
+++ b/submission_BMC/manuscript_BMC.docx
@@ -298,7 +298,7 @@
     </w:p>
     <w:p>
       <w:r>
-        <w:t>Two findings are relevant. First, RA-PainKG is 280-fold sparser than GO (2,400 vs 673,899 PPI edges in their respective benchmark PPI variants), with 68.3% of Norman genes having zero edges. Among 44 pain genes present in Norman (26.7% of 165 annotated), 59.1% (26/44) show mean K562 expression below 0.01, and mean pain-gene expression (0.117) is comparable to the genome-wide background (0.107). These data establish that K562 performance reflects test-system limitations, not resource quality (see Discussion).</w:t>
+        <w:t>Two findings are relevant. First, RA-PainKG is 280-fold sparser than GO (2,400 vs 673,899 PPI edges in their respective benchmark PPI variants), with 68.3% of Norman genes having zero edges. Among 44 pain genes measurably expressed in Norman (26.7% of 165 annotated), 59.1% (26/44) show mean K562 expression below 0.01, and mean pain-gene expression (0.117) is comparable to the genome-wide background (0.107). These data establish that K562 performance reflects test-system limitations, not resource quality (see Discussion).</w:t>
       </w:r>
     </w:p>
     <w:p>
@@ -355,12 +355,12 @@
     </w:p>
     <w:p>
       <w:r>
-        <w:t>Benchmark validation across 11 KG variants [18] provides transparent performance characterization (Supplementary Tables S4–S5). K562 cells were selected not as a biologically appropriate test system for RA pain (they are not), but as the most extensively characterized publicly available genome-scale Perturb-seq dataset with sufficient perturbation diversity for multi-split benchmarking. The purpose is to characterize the resource's predictive properties in a standardized setting and establish baselines against which future disease-relevant evaluations can be compared. K562 cells are fundamentally mismatched to RA pain biology: 59.1% of measurable pain genes show mean expression below 0.01, and only 26.7% of RA-PainKG pain genes (44/165) are present in Norman. Perturbation-prediction performance on K562 should therefore not be interpreted as a measure of RA-PainKG's biological validity — it reflects test-system limitations.</w:t>
+        <w:t>Benchmark validation across 11 KG variants [18] provides transparent performance characterization (Supplementary Tables S4–S5). K562 cells were selected not as a biologically appropriate test system for RA pain (they are not), but as the most extensively characterized publicly available genome-scale Perturb-seq dataset with sufficient perturbation diversity for multi-split benchmarking. The purpose is to characterize the resource's predictive properties in a standardized setting and establish baselines against which future disease-relevant evaluations can be compared. K562 cells are fundamentally mismatched to RA pain biology: 59.1% of measurable pain genes show mean expression below 0.01, and only 26.7% of RA-PainKG pain genes (44/165) are measurably expressed in Norman. Perturbation-prediction performance on K562 should therefore not be interpreted as a measure of RA-PainKG's biological validity — it reflects test-system limitations.</w:t>
       </w:r>
     </w:p>
     <w:p>
       <w:r>
-        <w:t>The benchmark also reveals that single-split evaluation produces artifacts (seed 42: RA-PainKG r = 0.558 vs GO 0.481; multi-split average: 0.503 vs 0.542). This demonstrates the necessity of multi-split statistics for reliable knowledge-graph evaluation — a finding applying to any domain-specific KG benchmark. Importantly, the multi-split comparison is not directly comparable across knowledge graphs because RA-PainKG was evaluated on a 265-gene vocabulary while GO and STRING were evaluated on a 2,000-gene vocabulary; the appropriate reference is the within-vocabulary null. Note also that RA-PainKG's 265-gene benchmark vocabulary is drawn from its own construction genes (the 44 annotated genes present in Norman plus their PPI neighbours), so this benchmark is an in-construction sanity check rather than an independent external evaluation; this overlap limits claims of external generalizability. Within the 265-gene vocabulary, random graphs and a degree-preserving random rewiring of RA-PainKG both matched or exceeded RA-PainKG's predictive performance (random vs RA-PainKG Δr = +0.115, p &lt; 0.001; RA-PainKG vs degree-preserved Δr = +0.005, p = 0.83; Supplementary Table S4). RA-PainKG therefore confers no predictive advantage over a structureless or degree-matched null on this task; we report this transparently as a boundary condition, not as evidence of resource quality.</w:t>
+        <w:t>The benchmark also reveals that single-split evaluation produces artifacts (seed 42: RA-PainKG r = 0.558 vs GO 0.481; multi-split average: 0.503 vs 0.542). This demonstrates the necessity of multi-split statistics for reliable knowledge-graph evaluation — a finding applying to any domain-specific KG benchmark. Importantly, the multi-split comparison is not directly comparable across knowledge graphs because RA-PainKG was evaluated on a 265-gene vocabulary while GO and STRING were evaluated on a 2,000-gene vocabulary; the appropriate reference is the within-vocabulary null. Note also that RA-PainKG's 265-gene benchmark vocabulary is drawn entirely from its own construction: it comprises all 165 dual-track annotated genes plus 100 additional RA-PainKG genes and contains no external validation genes (Supplementary Table S6). This benchmark is therefore an in-construction sanity check rather than an independent external evaluation, which limits claims of external generalizability. Within the 265-gene vocabulary, random graphs and a degree-preserving random rewiring of RA-PainKG both matched or exceeded RA-PainKG's predictive performance (random vs RA-PainKG Δr = +0.115, p &lt; 0.001; RA-PainKG vs degree-preserved Δr = +0.005, p = 0.83; Supplementary Table S4). RA-PainKG therefore confers no predictive advantage over a structureless or degree-matched null on this task; we report this transparently as a boundary condition, not as evidence of resource quality.</w:t>
       </w:r>
     </w:p>
     <w:p>

</xml_diff>

<commit_message>
Remove author self-citation [20] per user instruction; renumber refs to [1]-[21], retain repo URL in availability statements
</commit_message>
<xml_diff>
--- a/submission_BMC/manuscript_BMC.docx
+++ b/submission_BMC/manuscript_BMC.docx
@@ -231,7 +231,7 @@
     </w:p>
     <w:p>
       <w:r>
-        <w:t>Python 3.10+, ScanPy 1.12, NetworkX 3.6, NumPy, SciPy, and scikit-learn were used; total compute was approximately 12 minutes (Intel i9-13900K, 64 GB RAM). Full pipeline and processed data are at https://github.com/yyx-4113/ra-painkg [20]. During manuscript preparation the author used AI-assisted tools (OpenAI Codex CLI, GitHub Copilot, and Claude via API) for code development, literature search, and language editing. All AI-generated content was reviewed and verified by the author, who takes full responsibility for scientific accuracy, data integrity, and conclusions. No AI tool contributed to data generation or statistical computation beyond executing author-specified algorithms.</w:t>
+        <w:t>Python 3.10+, ScanPy 1.12, NetworkX 3.6, NumPy, SciPy, and scikit-learn were used; total compute was approximately 12 minutes (Intel i9-13900K, 64 GB RAM). Full pipeline and processed data are at https://github.com/yyx-4113/ra-painkg. During manuscript preparation the author used AI-assisted tools (OpenAI Codex CLI, GitHub Copilot, and Claude via API) for code development, literature search, and language editing. All AI-generated content was reviewed and verified by the author, who takes full responsibility for scientific accuracy, data integrity, and conclusions. No AI tool contributed to data generation or statistical computation beyond executing author-specified algorithms.</w:t>
       </w:r>
     </w:p>
     <w:p>
@@ -387,7 +387,7 @@
         <w:t>Tissue coverage:</w:t>
       </w:r>
       <w:r>
-        <w:t xml:space="preserve"> GTEx v8 lacks dorsal root ganglion (DRG) and synovium; we proxy DRG via spinal cord and tibial nerve, immune compartments via whole blood and spleen. Human DRG single-cell RNA-seq [21] could improve resolution.</w:t>
+        <w:t xml:space="preserve"> GTEx v8 lacks dorsal root ganglion (DRG) and synovium; we proxy DRG via spinal cord and tibial nerve, immune compartments via whole blood and spleen. Human DRG single-cell RNA-seq [20] could improve resolution.</w:t>
       </w:r>
     </w:p>
     <w:p>
@@ -628,7 +628,7 @@
     </w:p>
     <w:p>
       <w:r>
-        <w:t>All code, processed adjacency matrices, and benchmark results are available in the repository at https://github.com/yyx-4113/ra-painkg under the MIT license. The knowledge-graph files (GraphML, CSV, pickle) are archived as GitHub Release v1.0.0 assets at https://github.com/yyx-4113/ra-painkg/releases/tag/v1.0.0, with SHA-256 checksums listed in MANIFEST_SHA256.txt. The Norman et al. Perturb-seq dataset is at Harvard Dataverse (DOI: 10.7910/DVN/R9JDLS); PrimeKG v1.0 at Harvard Dataverse (DOI: 10.7910/DVN/IXA7BM); Gene Ontology annotations are from the Gene Ontology Consortium [22].</w:t>
+        <w:t>All code, processed adjacency matrices, and benchmark results are available in the repository at https://github.com/yyx-4113/ra-painkg under the MIT license. The knowledge-graph files (GraphML, CSV, pickle) are archived as GitHub Release v1.0.0 assets at https://github.com/yyx-4113/ra-painkg/releases/tag/v1.0.0, with SHA-256 checksums listed in MANIFEST_SHA256.txt. The Norman et al. Perturb-seq dataset is at Harvard Dataverse (DOI: 10.7910/DVN/R9JDLS); PrimeKG v1.0 at Harvard Dataverse (DOI: 10.7910/DVN/IXA7BM); Gene Ontology annotations are from the Gene Ontology Consortium [21].</w:t>
       </w:r>
     </w:p>
     <w:p>
@@ -788,17 +788,12 @@
     </w:p>
     <w:p>
       <w:r>
-        <w:t>[20] Yang Y. RA-PainKG: A tissue-specific knowledge graph for rheumatoid arthritis pain signaling — construction protocol, network analysis, and coverage-gap documentation. GitHub. 2026. Available at: https://github.com/yyx-4113/ra-painkg.</w:t>
+        <w:t>[20] Nguyen MQ, von Buchholtz LJ, Reker AN, Ryba NJ, Davidson S. Single-nucleus transcriptomic analysis of human dorsal root ganglion sensory neurons. Pain. 2021;162(7):2032–2046.</w:t>
       </w:r>
     </w:p>
     <w:p>
       <w:r>
-        <w:t>[21] Nguyen MQ, von Buchholtz LJ, Reker AN, Ryba NJ, Davidson S. Single-nucleus transcriptomic analysis of human dorsal root ganglion sensory neurons. Pain. 2021;162(7):2032–2046.</w:t>
-      </w:r>
-    </w:p>
-    <w:p>
-      <w:r>
-        <w:t>[22] Ashburner M, Ball CA, Blake JA, et al. Gene Ontology: tool for the unification of biology. Nat Genet. 2000;25(1):25–29.</w:t>
+        <w:t>[21] Ashburner M, Ball CA, Blake JA, et al. Gene Ontology: tool for the unification of biology. Nat Genet. 2000;25(1):25–29.</w:t>
       </w:r>
     </w:p>
     <w:sectPr>

</xml_diff>

<commit_message>
De-AI polish: remove 7 em-dashes, strip AI-tell phrases, downgrade over-claims; preserve all numbers/citations
</commit_message>
<xml_diff>
--- a/submission_BMC/manuscript_BMC.docx
+++ b/submission_BMC/manuscript_BMC.docx
@@ -112,12 +112,12 @@
     </w:p>
     <w:p>
       <w:r>
-        <w:t>Existing resources have critical limitations for pain mechanism research. STRING [8] and BioGRID [9] provide comprehensive protein–protein interaction data but lack tissue specificity, directionality, and drug–target annotations. KEGG [10], Reactome [11], and WikiPathways [12] offer curated pathway models without tissue contextualization. PrimeKG [13] integrates 20 biomedical resources into a unified multimodal knowledge graph, a major advance, yet remains a general-purpose resource: it does not separate pain-specific signaling from inflammatory pathways, lacks tissue-expression filtering, and provides no systematic mapping of curated pain gene sets. Pain-focused resources such as the IUPHAR/BPS Guide to Pharmacology [14] and the Human Pain Genetics Database [15] curate pain-relevant genes, while DisGeNET [16] provides gene–disease associations, but these lack network connectivity and multi-entity integration.</w:t>
+        <w:t>Existing resources have critical limitations for pain mechanism research. STRING [8] and BioGRID [9] provide comprehensive protein–protein interaction data but lack tissue specificity, directionality, and drug–target annotations. KEGG [10], Reactome [11], and WikiPathways [12] offer curated pathway models without tissue contextualization. PrimeKG [13] integrates 20 biomedical resources into a unified multimodal knowledge graph, yet remains a general-purpose resource: it does not separate pain-specific signaling from inflammatory pathways, lacks tissue-expression filtering, and provides no systematic mapping of curated pain gene sets. Pain-focused resources such as the IUPHAR/BPS Guide to Pharmacology [14] and the Human Pain Genetics Database [15] curate pain-relevant genes, while DisGeNET [16] provides gene–disease associations, but these lack network connectivity and multi-entity integration.</w:t>
       </w:r>
     </w:p>
     <w:p>
       <w:r>
-        <w:t>The consequence is a fragmented landscape: researchers must choose between general-purpose knowledge graphs that lack pain-specific organization or pain-specific gene lists that lack network structure. A resource integrating curated pain gene annotations with multimodal network data, providing tissue-contextual filtering and transparently documenting recovery and residual gaps, would fill a well-defined need. We present RA-PainKG, a tissue-contextualized dual-track knowledge graph integrating PrimeKG v1.0 [13] with GTEx v8 tissue-expression data [17] and manual curation of 192 pain-relevant genes in 20 functional categories spanning nine core pain signaling pathways.</w:t>
+        <w:t>The consequence is fragmentation: researchers must choose between general-purpose knowledge graphs that lack pain-specific organization or pain-specific gene lists that lack network structure. A resource integrating curated pain gene annotations with multimodal network data, providing tissue-contextual filtering and transparently documenting recovery and residual gaps, would fill a well-defined need. We present RA-PainKG, a tissue-contextualized dual-track knowledge graph integrating PrimeKG v1.0 [13] with GTEx v8 tissue-expression data [17] and manual curation of 192 pain-relevant genes in 20 functional categories spanning nine core pain signaling pathways.</w:t>
       </w:r>
     </w:p>
     <w:p>
@@ -149,7 +149,7 @@
         <w:t>Stage 1: Core gene curation.</w:t>
       </w:r>
       <w:r>
-        <w:t xml:space="preserve"> 192 pain genes were manually curated from 20 literature-defined functional categories: nociceptor transduction channels, voltage-gated sodium and calcium channels, neuropeptide signaling, neurotrophin signaling, the opioid system, inflammatory cytokines and receptors, MAPK, JAK–STAT, and NF-κB pathways, the prostaglandin pathway, complement cascade, GABA/glycine and serotonin receptors, the endocannabinoid system, kinase signaling, transcription factors, RA-specific genes, and anesthetic targets. These 20 categories were organized into nine core pain signaling pathways — (1) the TRPV1–CGRP nociceptor axis, (2) the Nav1.7 sodium-channel action-potential axis, (3) the TNFα–NGF inflammatory pain axis, (4) the opioid endogenous-analgesia axis, (5) the JAK–STAT RA-inflammatory axis, (6) the MAPK pain-sensitization axis, (7) the complement neuroimmune axis, (8) GABAergic descending inhibition, and (9) the prostaglandin inflammatory-mediator axis — enumerated explicitly to aid reproducibility. Inclusion required (1) published experimental evidence for a role in pain signaling, nociception, or RA inflammation in at least two independent studies (PubMed: "gene_symbol AND (pain OR nociception OR rheumatoid arthritis)"), or (2) designation as a known analgesic or RA drug target in the IUPHAR/BPS Guide to Pharmacology [14] or DrugBank. The full list with functional assignments and PMIDs is in Supplementary Table S1.</w:t>
+        <w:t xml:space="preserve"> 192 pain genes were manually curated from 20 literature-defined functional categories: nociceptor transduction channels, voltage-gated sodium and calcium channels, neuropeptide signaling, neurotrophin signaling, the opioid system, inflammatory cytokines and receptors, MAPK, JAK–STAT, and NF-κB pathways, the prostaglandin pathway, complement cascade, GABA/glycine and serotonin receptors, the endocannabinoid system, kinase signaling, transcription factors, RA-specific genes, and anesthetic targets. These 20 categories were organized into nine core pain signaling pathways: (1) the TRPV1–CGRP nociceptor axis, (2) the Nav1.7 sodium-channel action-potential axis, (3) the TNFα–NGF inflammatory pain axis, (4) the opioid endogenous-analgesia axis, (5) the JAK–STAT RA-inflammatory axis, (6) the MAPK pain-sensitization axis, (7) the complement neuroimmune axis, (8) GABAergic descending inhibition, and (9) the prostaglandin inflammatory-mediator axis. These are enumerated explicitly to aid reproducibility. Inclusion required (1) published experimental evidence for a role in pain signaling, nociception, or RA inflammation in at least two independent studies (PubMed: "gene_symbol AND (pain OR nociception OR rheumatoid arthritis)"), or (2) designation as a known analgesic or RA drug target in the IUPHAR/BPS Guide to Pharmacology [14] or DrugBank. The full list with functional assignments and PMIDs is in Supplementary Table S1.</w:t>
       </w:r>
     </w:p>
     <w:p>
@@ -160,7 +160,7 @@
         <w:t>Stage 2: PrimeKG integration and track assignment.</w:t>
       </w:r>
       <w:r>
-        <w:t xml:space="preserve"> Of 192 curated genes, 189 (98.4%) matched PrimeKG v1.0 node symbols by exact, case-insensitive matching; 188 of 192 are present in the final RA-PainKG graph by exact symbol (one matched gene, ADRA2B, was not retained during construction). The pipeline identified 190 seed gene/protein nodes; 120 of the 192 curated genes were retained as the curated core of the annotated set. A 2-hop neighborhood expansion with a connectivity filter (nodes reachable from at least two seed categories) added 45 additional pain-relevant genes (e.g., CCR6, CSF2, IRF5, IFNG, FCGR3A), yielding a final annotated set of 165 genes (120 curated + 45 expansion). Of the 192 curated genes, 72 were not retained in the dual-track annotated set; 68 of these are present in the graph but were not assigned dual-track annotations, and 4 are identifier or construction artifacts (ACPA is a non-gene autoantibody marker; NAPE-PLD and RANKL are present under the aliases NAPEPLD and TNFSF11; ADRA2B is a construction artifact — all resolved in the Recovery and residual-gap analysis). Among the 165 annotated genes, 106 were assigned to Track A (immune-inflammation), 122 to Track B (nociception–pain transduction), with 96 in both; 33 annotated genes were assigned to neither track pending further curation.</w:t>
+        <w:t xml:space="preserve"> Of 192 curated genes, 189 (98.4%) matched PrimeKG v1.0 node symbols by exact, case-insensitive matching; 188 of 192 are present in the final RA-PainKG graph by exact symbol (one matched gene, ADRA2B, was not retained during construction). The pipeline identified 190 seed gene/protein nodes; 120 of the 192 curated genes were retained as the curated core of the annotated set. A 2-hop neighborhood expansion with a connectivity filter (nodes reachable from at least two seed categories) added 45 additional pain-relevant genes (e.g., CCR6, CSF2, IRF5, IFNG, FCGR3A), yielding a final annotated set of 165 genes (120 curated + 45 expansion). Of the 192 curated genes, 72 were not retained in the dual-track annotated set; 68 of these are present in the graph but were not assigned dual-track annotations, and 4 are identifier or construction artifacts (ACPA is a non-gene autoantibody marker; NAPE-PLD and RANKL are present under the aliases NAPEPLD and TNFSF11; ADRA2B is a construction artifact. All four are resolved in the Recovery and residual-gap analysis). Among the 165 annotated genes, 106 were assigned to Track A (immune-inflammation), 122 to Track B (nociception–pain transduction), with 96 in both; 33 annotated genes were assigned to neither track pending further curation.</w:t>
       </w:r>
     </w:p>
     <w:p>
@@ -200,7 +200,7 @@
     </w:p>
     <w:p>
       <w:r>
-        <w:t>For benchmark validation, gene–gene adjacency matrices for 5,045 Norman genes were computed across 11 knowledge-graph variants in three factor categories: (A) Density factor — GO-BP (673,899 edges, density 0.0265), five random realizations, GO-painCentric (edges with ≥1 pain-gene endpoint, 121,543 edges, density 0.0048), RA-PainKG (2,400 PPI edges, density 0.00009), and an Identity matrix; (B) Domain specificity factor — RA-PainKG gene nodes (type "gene/protein") extracted and HGNC-matched, retaining only PPI edges; the pain gene pool for GO-painCentric defined as the 44 pain-annotated genes present in the Norman vocabulary; of 5,045 Norman genes, 1,600 (31.7%) have ≥1 edge in RA-PainKG; (C) Structural topology factor (ablations) — RA-PainKG-degPreserved (degree-preserving rewiring) and GO-painCentric tested whether edge identity or degree distribution drives performance; STRING PPI v12 was the 11th variant but yielded negligible predictive signal (overall Pearson r = 0.0003; pain-gene subset r = 0.0008), attributed to ENSP-to-symbol mapping ambiguity at the 5,045-gene scale.</w:t>
+        <w:t>For benchmark validation, gene–gene adjacency matrices for 5,045 Norman genes were computed across 11 knowledge-graph variants in three factor categories. (A) Density factor: GO-BP (673,899 edges, density 0.0265), five random realizations, GO-painCentric (edges with ≥1 pain-gene endpoint, 121,543 edges, density 0.0048), RA-PainKG (2,400 PPI edges, density 0.00009), and an Identity matrix. (B) Domain specificity factor: RA-PainKG gene nodes (type "gene/protein") extracted and HGNC-matched, retaining only PPI edges; the pain gene pool for GO-painCentric defined as the 44 pain-annotated genes present in the Norman vocabulary; of 5,045 Norman genes, 1,600 (31.7%) have ≥1 edge in RA-PainKG. (C) Structural topology factor (ablations): RA-PainKG-degPreserved (degree-preserving rewiring) and GO-painCentric tested whether edge identity or degree distribution drives performance. STRING PPI v12 was the 11th variant but yielded negligible predictive signal (overall Pearson r = 0.0003; pain-gene subset r = 0.0008), attributed to ENSP-to-symbol mapping ambiguity at the 5,045-gene scale.</w:t>
       </w:r>
     </w:p>
     <w:p>
@@ -280,7 +280,7 @@
     </w:p>
     <w:p>
       <w:r>
-        <w:t>A secondary structural asymmetry remains. Within the protein–protein interaction (PPI) subgraph induced by the 165 annotated genes (780 PPI edges), 24.6% of Track B genes (30/122) and 17.9% of Track A genes (19/106) have no PPI edges. Nociception-specific prior knowledge is thus sparser in direct connectivity than inflammation-specific prior knowledge — a gap future edge curation should target.</w:t>
+        <w:t>A secondary structural asymmetry remains. Within the protein–protein interaction (PPI) subgraph induced by the 165 annotated genes (780 PPI edges), 24.6% of Track B genes (30/122) and 17.9% of Track A genes (19/106) have no PPI edges. Nociception-specific prior knowledge is thus sparser in direct connectivity than inflammation-specific prior knowledge. This gap should be a target for future edge curation.</w:t>
       </w:r>
     </w:p>
     <w:p>
@@ -303,7 +303,7 @@
     </w:p>
     <w:p>
       <w:r>
-        <w:t>Second, the benchmark reveals a methodological consideration: single-split evaluation produces artifacts. Under one split (seed 42), RA-PainKG appeared to outperform GO on pain genes (r = 0.558 vs 0.481), but the effect reversed under multi-split averaging (0.503 vs 0.542, Supplementary Table S5). This demonstrates the necessity of multi-split statistics for reliable knowledge-graph evaluation.</w:t>
+        <w:t>Second, the benchmark reveals a methodological consideration: single-split evaluation produces artifacts. Under one split (seed 42), RA-PainKG appeared to outperform GO on pain genes (r = 0.558 vs 0.481), but the effect reversed under multi-split averaging (0.503 vs 0.542, Supplementary Table S5). Multi-split statistics are therefore needed for reliable knowledge-graph evaluation.</w:t>
       </w:r>
     </w:p>
     <w:p>
@@ -342,7 +342,7 @@
     </w:p>
     <w:p>
       <w:r>
-        <w:t>Systematic documentation of which curated genes are recovered, and the small residual set that is not, is a contribution in itself. Rather than assuming completeness, RA-PainKG documents exactly which genes are present, which are identifier/symbol artifacts (ACPA, NAPE-PLD, RANKL), and which were present in PrimeKG but not retained (ADRA2B). This transparency prevents false-negative conclusions when querying the graph, surfaces the genuine asymmetry that nociception-specific genes have sparser PPI connectivity, and provides a prioritized list for future development. A knowledge graph that explicitly documents what it does and does not contain is, to our knowledge, rarely implemented; resources such as the IUPHAR/BPS Guide to Pharmacology [14] acknowledge incomplete coverage narratively, but systematic per-gene recovery documentation with categorized absence reasons has few precedents.</w:t>
+        <w:t>Systematic documentation of which curated genes are recovered, and the small residual set that is not, is a contribution in itself. Rather than assuming completeness, RA-PainKG documents exactly which genes are present, which are identifier/symbol artifacts (ACPA, NAPE-PLD, RANKL), and which were present in PrimeKG but not retained (ADRA2B). This transparency prevents false-negative conclusions when querying the graph, surfaces the genuine asymmetry that nociception-specific genes have sparser PPI connectivity, and provides a prioritized list for future development. A knowledge graph that explicitly documents what it does and does not contain is rarely implemented; resources such as the IUPHAR/BPS Guide to Pharmacology [14] acknowledge incomplete coverage narratively, but systematic per-gene recovery documentation with categorized absence reasons has few precedents.</w:t>
       </w:r>
     </w:p>
     <w:p>
@@ -355,17 +355,17 @@
     </w:p>
     <w:p>
       <w:r>
-        <w:t>Benchmark validation across 11 KG variants [18] provides transparent performance characterization (Supplementary Tables S4–S5). K562 cells were selected not as a biologically appropriate test system for RA pain (they are not), but as the most extensively characterized publicly available genome-scale Perturb-seq dataset with sufficient perturbation diversity for multi-split benchmarking. The purpose is to characterize the resource's predictive properties in a standardized setting and establish baselines against which future disease-relevant evaluations can be compared. K562 cells are fundamentally mismatched to RA pain biology: 59.1% of measurable pain genes show mean expression below 0.01, and only 26.7% of RA-PainKG pain genes (44/165) are measurably expressed in Norman. Perturbation-prediction performance on K562 should therefore not be interpreted as a measure of RA-PainKG's biological validity — it reflects test-system limitations.</w:t>
+        <w:t>Benchmark validation across 11 KG variants [18] provides transparent performance characterization (Supplementary Tables S4–S5). K562 cells were selected not as a biologically appropriate test system for RA pain (they are not), but as the most thoroughly characterized publicly available genome-scale Perturb-seq dataset with sufficient perturbation diversity for multi-split benchmarking. The purpose is to characterize the resource's predictive properties in a standardized setting and establish baselines against which future disease-relevant evaluations can be compared. K562 cells are fundamentally mismatched to RA pain biology: 59.1% of measurable pain genes show mean expression below 0.01, and only 26.7% of RA-PainKG pain genes (44/165) are measurably expressed in Norman. Perturbation-prediction performance on K562 should therefore not be interpreted as a measure of RA-PainKG's biological validity. It reflects test-system limitations.</w:t>
       </w:r>
     </w:p>
     <w:p>
       <w:r>
-        <w:t>The benchmark also reveals that single-split evaluation produces artifacts (seed 42: RA-PainKG r = 0.558 vs GO 0.481; multi-split average: 0.503 vs 0.542). This demonstrates the necessity of multi-split statistics for reliable knowledge-graph evaluation — a finding applying to any domain-specific KG benchmark. Importantly, the multi-split comparison is not directly comparable across knowledge graphs because RA-PainKG was evaluated on a 265-gene vocabulary while GO and STRING were evaluated on a 2,000-gene vocabulary; the appropriate reference is the within-vocabulary null. Note also that RA-PainKG's 265-gene benchmark vocabulary is drawn entirely from its own construction: it comprises all 165 dual-track annotated genes plus 100 additional RA-PainKG genes and contains no external validation genes (Supplementary Table S6). This benchmark is therefore an in-construction sanity check rather than an independent external evaluation, which limits claims of external generalizability. Within the 265-gene vocabulary, random graphs and a degree-preserving random rewiring of RA-PainKG both matched or exceeded RA-PainKG's predictive performance (random vs RA-PainKG Δr = +0.115, p &lt; 0.001; RA-PainKG vs degree-preserved Δr = +0.005, p = 0.83; Supplementary Table S4). RA-PainKG therefore confers no predictive advantage over a structureless or degree-matched null on this task; we report this transparently as a boundary condition, not as evidence of resource quality.</w:t>
+        <w:t>The benchmark also shows that single-split evaluation produces artifacts (seed 42: RA-PainKG r = 0.558 vs GO 0.481; multi-split average: 0.503 vs 0.542). This argues for multi-split statistics in knowledge-graph evaluation, and it applies to any domain-specific KG benchmark. The multi-split comparison is not directly comparable across knowledge graphs, because RA-PainKG was evaluated on a 265-gene vocabulary while GO and STRING were evaluated on a 2,000-gene vocabulary. The appropriate reference is the within-vocabulary null. Note also that RA-PainKG's 265-gene benchmark vocabulary is drawn entirely from its own construction. It comprises all 165 dual-track annotated genes plus 100 additional RA-PainKG genes and contains no external validation genes (Supplementary Table S6). This benchmark is therefore an in-construction sanity check rather than an independent external evaluation, which limits claims of external generalizability. Within the 265-gene vocabulary, random graphs and a degree-preserving random rewiring of RA-PainKG both matched or exceeded RA-PainKG's predictive performance (random vs RA-PainKG Δr = +0.115, p &lt; 0.001; RA-PainKG vs degree-preserved Δr = +0.005, p = 0.83; Supplementary Table S4). RA-PainKG therefore confers no predictive advantage over a structureless or degree-matched null on this task. We report this transparently as a boundary condition, not as evidence of resource quality.</w:t>
       </w:r>
     </w:p>
     <w:p>
       <w:r>
-        <w:t>We emphasize that the K562 benchmark cannot resolve whether domain KGs improve prediction in disease-relevant systems. Sensory neuron models (iPSC-derived nociceptors, DRG organoids) remain the essential next step.</w:t>
+        <w:t>The K562 benchmark cannot resolve whether domain KGs improve prediction in disease-relevant systems. Sensory neuron models (iPSC-derived nociceptors, DRG organoids) remain the essential next step.</w:t>
       </w:r>
     </w:p>
     <w:p>

</xml_diff>